<commit_message>
updated screen flow diagram
</commit_message>
<xml_diff>
--- a/Muhammad_Aditya_Pramudita_Technical_Assesment_Solution_Analyst.docx
+++ b/Muhammad_Aditya_Pramudita_Technical_Assesment_Solution_Analyst.docx
@@ -1707,7 +1707,7 @@
           <w:lang w:val="en-US"/>
         </w:rPr>
         <w:drawing>
-          <wp:inline distT="0" distB="0" distL="0" distR="0" wp14:anchorId="29A83C9B" wp14:editId="7660E078">
+          <wp:inline distT="0" distB="0" distL="0" distR="0" wp14:anchorId="29A83C9B" wp14:editId="160AE626">
             <wp:extent cx="3440242" cy="3589655"/>
             <wp:effectExtent l="0" t="0" r="1905" b="4445"/>
             <wp:docPr id="1120996751" name="Picture 1" descr="A diagram of a service&#10;&#10;AI-generated content may be incorrect."/>
@@ -1783,6 +1783,464 @@
           <w:lang w:val="en-US"/>
         </w:rPr>
       </w:pPr>
+      <w:r>
+        <w:rPr>
+          <w:rFonts w:cs="Calibri"/>
+          <w:noProof/>
+          <w:color w:val="4C94D8" w:themeColor="text2" w:themeTint="80"/>
+          <w:sz w:val="28"/>
+          <w:szCs w:val="28"/>
+          <w:lang w:val="en-US"/>
+        </w:rPr>
+        <w:drawing>
+          <wp:inline distT="0" distB="0" distL="0" distR="0" wp14:anchorId="076833B6" wp14:editId="081A39F6">
+            <wp:extent cx="5943600" cy="3474085"/>
+            <wp:effectExtent l="0" t="0" r="0" b="5715"/>
+            <wp:docPr id="390904844" name="Picture 1" descr="A diagram of a computer program&#10;&#10;AI-generated content may be incorrect."/>
+            <wp:cNvGraphicFramePr>
+              <a:graphicFrameLocks xmlns:a="http://schemas.openxmlformats.org/drawingml/2006/main" noChangeAspect="1"/>
+            </wp:cNvGraphicFramePr>
+            <a:graphic xmlns:a="http://schemas.openxmlformats.org/drawingml/2006/main">
+              <a:graphicData uri="http://schemas.openxmlformats.org/drawingml/2006/picture">
+                <pic:pic xmlns:pic="http://schemas.openxmlformats.org/drawingml/2006/picture">
+                  <pic:nvPicPr>
+                    <pic:cNvPr id="390904844" name="Picture 1" descr="A diagram of a computer program&#10;&#10;AI-generated content may be incorrect."/>
+                    <pic:cNvPicPr/>
+                  </pic:nvPicPr>
+                  <pic:blipFill>
+                    <a:blip r:embed="rId6">
+                      <a:extLst>
+                        <a:ext uri="{28A0092B-C50C-407E-A947-70E740481C1C}">
+                          <a14:useLocalDpi xmlns:a14="http://schemas.microsoft.com/office/drawing/2010/main" val="0"/>
+                        </a:ext>
+                      </a:extLst>
+                    </a:blip>
+                    <a:stretch>
+                      <a:fillRect/>
+                    </a:stretch>
+                  </pic:blipFill>
+                  <pic:spPr>
+                    <a:xfrm>
+                      <a:off x="0" y="0"/>
+                      <a:ext cx="5943600" cy="3474085"/>
+                    </a:xfrm>
+                    <a:prstGeom prst="rect">
+                      <a:avLst/>
+                    </a:prstGeom>
+                  </pic:spPr>
+                </pic:pic>
+              </a:graphicData>
+            </a:graphic>
+          </wp:inline>
+        </w:drawing>
+      </w:r>
+    </w:p>
+    <w:p>
+      <w:pPr>
+        <w:pStyle w:val="ListParagraph"/>
+        <w:numPr>
+          <w:ilvl w:val="0"/>
+          <w:numId w:val="6"/>
+        </w:numPr>
+        <w:spacing w:line="240" w:lineRule="auto"/>
+        <w:rPr>
+          <w:rFonts w:cs="Calibri"/>
+          <w:b/>
+          <w:bCs/>
+          <w:color w:val="000000" w:themeColor="text1"/>
+          <w:lang w:val="en-US"/>
+        </w:rPr>
+      </w:pPr>
+      <w:r>
+        <w:rPr>
+          <w:rFonts w:cs="Calibri"/>
+          <w:b/>
+          <w:bCs/>
+          <w:color w:val="000000" w:themeColor="text1"/>
+          <w:lang w:val="en-US"/>
+        </w:rPr>
+        <w:t>Splash Screen</w:t>
+      </w:r>
+    </w:p>
+    <w:p>
+      <w:pPr>
+        <w:spacing w:line="240" w:lineRule="auto"/>
+        <w:rPr>
+          <w:rFonts w:cs="Calibri"/>
+          <w:color w:val="000000" w:themeColor="text1"/>
+          <w:lang w:val="en-US"/>
+        </w:rPr>
+      </w:pPr>
+      <w:r>
+        <w:rPr>
+          <w:rFonts w:cs="Calibri"/>
+          <w:color w:val="000000" w:themeColor="text1"/>
+          <w:lang w:val="en-US"/>
+        </w:rPr>
+        <w:t xml:space="preserve">Menampilkan logo </w:t>
+      </w:r>
+      <w:proofErr w:type="spellStart"/>
+      <w:r>
+        <w:rPr>
+          <w:rFonts w:cs="Calibri"/>
+          <w:color w:val="000000" w:themeColor="text1"/>
+          <w:lang w:val="en-US"/>
+        </w:rPr>
+        <w:t>aplikasi</w:t>
+      </w:r>
+      <w:proofErr w:type="spellEnd"/>
+      <w:r>
+        <w:rPr>
+          <w:rFonts w:cs="Calibri"/>
+          <w:color w:val="000000" w:themeColor="text1"/>
+          <w:lang w:val="en-US"/>
+        </w:rPr>
+        <w:t xml:space="preserve"> ketika di </w:t>
+      </w:r>
+      <w:proofErr w:type="spellStart"/>
+      <w:r>
+        <w:rPr>
+          <w:rFonts w:cs="Calibri"/>
+          <w:color w:val="000000" w:themeColor="text1"/>
+          <w:lang w:val="en-US"/>
+        </w:rPr>
+        <w:t>buka</w:t>
+      </w:r>
+      <w:proofErr w:type="spellEnd"/>
+      <w:r>
+        <w:rPr>
+          <w:rFonts w:cs="Calibri"/>
+          <w:color w:val="000000" w:themeColor="text1"/>
+          <w:lang w:val="en-US"/>
+        </w:rPr>
+        <w:t xml:space="preserve"> di </w:t>
+      </w:r>
+      <w:proofErr w:type="spellStart"/>
+      <w:r>
+        <w:rPr>
+          <w:rFonts w:cs="Calibri"/>
+          <w:color w:val="000000" w:themeColor="text1"/>
+          <w:lang w:val="en-US"/>
+        </w:rPr>
+        <w:t>awal</w:t>
+      </w:r>
+      <w:proofErr w:type="spellEnd"/>
+      <w:r>
+        <w:rPr>
+          <w:rFonts w:cs="Calibri"/>
+          <w:color w:val="000000" w:themeColor="text1"/>
+          <w:lang w:val="en-US"/>
+        </w:rPr>
+        <w:t xml:space="preserve"> </w:t>
+      </w:r>
+      <w:proofErr w:type="spellStart"/>
+      <w:r>
+        <w:rPr>
+          <w:rFonts w:cs="Calibri"/>
+          <w:color w:val="000000" w:themeColor="text1"/>
+          <w:lang w:val="en-US"/>
+        </w:rPr>
+        <w:t>sistem</w:t>
+      </w:r>
+      <w:proofErr w:type="spellEnd"/>
+      <w:r>
+        <w:rPr>
+          <w:rFonts w:cs="Calibri"/>
+          <w:color w:val="000000" w:themeColor="text1"/>
+          <w:lang w:val="en-US"/>
+        </w:rPr>
+        <w:t xml:space="preserve"> </w:t>
+      </w:r>
+      <w:proofErr w:type="spellStart"/>
+      <w:r>
+        <w:rPr>
+          <w:rFonts w:cs="Calibri"/>
+          <w:color w:val="000000" w:themeColor="text1"/>
+          <w:lang w:val="en-US"/>
+        </w:rPr>
+        <w:t>melakukan</w:t>
+      </w:r>
+      <w:proofErr w:type="spellEnd"/>
+      <w:r>
+        <w:rPr>
+          <w:rFonts w:cs="Calibri"/>
+          <w:color w:val="000000" w:themeColor="text1"/>
+          <w:lang w:val="en-US"/>
+        </w:rPr>
+        <w:t xml:space="preserve"> </w:t>
+      </w:r>
+      <w:proofErr w:type="spellStart"/>
+      <w:r>
+        <w:rPr>
+          <w:rFonts w:cs="Calibri"/>
+          <w:color w:val="000000" w:themeColor="text1"/>
+          <w:lang w:val="en-US"/>
+        </w:rPr>
+        <w:t>pengecekan</w:t>
+      </w:r>
+      <w:proofErr w:type="spellEnd"/>
+      <w:r>
+        <w:rPr>
+          <w:rFonts w:cs="Calibri"/>
+          <w:color w:val="000000" w:themeColor="text1"/>
+          <w:lang w:val="en-US"/>
+        </w:rPr>
+        <w:t xml:space="preserve"> di </w:t>
+      </w:r>
+      <w:proofErr w:type="spellStart"/>
+      <w:r>
+        <w:rPr>
+          <w:rFonts w:cs="Calibri"/>
+          <w:color w:val="000000" w:themeColor="text1"/>
+          <w:lang w:val="en-US"/>
+        </w:rPr>
+        <w:t>awal</w:t>
+      </w:r>
+      <w:proofErr w:type="spellEnd"/>
+      <w:r>
+        <w:rPr>
+          <w:rFonts w:cs="Calibri"/>
+          <w:color w:val="000000" w:themeColor="text1"/>
+          <w:lang w:val="en-US"/>
+        </w:rPr>
+        <w:t>:</w:t>
+      </w:r>
+    </w:p>
+    <w:p>
+      <w:pPr>
+        <w:pStyle w:val="ListParagraph"/>
+        <w:numPr>
+          <w:ilvl w:val="0"/>
+          <w:numId w:val="7"/>
+        </w:numPr>
+        <w:spacing w:line="240" w:lineRule="auto"/>
+        <w:rPr>
+          <w:rFonts w:cs="Calibri"/>
+          <w:color w:val="000000" w:themeColor="text1"/>
+          <w:lang w:val="en-US"/>
+        </w:rPr>
+      </w:pPr>
+      <w:r>
+        <w:rPr>
+          <w:rFonts w:cs="Calibri"/>
+          <w:color w:val="000000" w:themeColor="text1"/>
+          <w:lang w:val="en-US"/>
+        </w:rPr>
+        <w:t xml:space="preserve">Apakah user </w:t>
+      </w:r>
+      <w:proofErr w:type="spellStart"/>
+      <w:r>
+        <w:rPr>
+          <w:rFonts w:cs="Calibri"/>
+          <w:color w:val="000000" w:themeColor="text1"/>
+          <w:lang w:val="en-US"/>
+        </w:rPr>
+        <w:t>sudah</w:t>
+      </w:r>
+      <w:proofErr w:type="spellEnd"/>
+      <w:r>
+        <w:rPr>
+          <w:rFonts w:cs="Calibri"/>
+          <w:color w:val="000000" w:themeColor="text1"/>
+          <w:lang w:val="en-US"/>
+        </w:rPr>
+        <w:t xml:space="preserve"> </w:t>
+      </w:r>
+      <w:proofErr w:type="spellStart"/>
+      <w:r>
+        <w:rPr>
+          <w:rFonts w:cs="Calibri"/>
+          <w:color w:val="000000" w:themeColor="text1"/>
+          <w:lang w:val="en-US"/>
+        </w:rPr>
+        <w:t>pernah</w:t>
+      </w:r>
+      <w:proofErr w:type="spellEnd"/>
+      <w:r>
+        <w:rPr>
+          <w:rFonts w:cs="Calibri"/>
+          <w:color w:val="000000" w:themeColor="text1"/>
+          <w:lang w:val="en-US"/>
+        </w:rPr>
+        <w:t xml:space="preserve"> login</w:t>
+      </w:r>
+    </w:p>
+    <w:p>
+      <w:pPr>
+        <w:pStyle w:val="ListParagraph"/>
+        <w:numPr>
+          <w:ilvl w:val="0"/>
+          <w:numId w:val="7"/>
+        </w:numPr>
+        <w:spacing w:line="240" w:lineRule="auto"/>
+        <w:rPr>
+          <w:rFonts w:cs="Calibri"/>
+          <w:color w:val="000000" w:themeColor="text1"/>
+          <w:lang w:val="en-US"/>
+        </w:rPr>
+      </w:pPr>
+      <w:r>
+        <w:rPr>
+          <w:rFonts w:cs="Calibri"/>
+          <w:color w:val="000000" w:themeColor="text1"/>
+          <w:lang w:val="en-US"/>
+        </w:rPr>
+        <w:t xml:space="preserve">Apakah user </w:t>
+      </w:r>
+      <w:proofErr w:type="spellStart"/>
+      <w:r>
+        <w:rPr>
+          <w:rFonts w:cs="Calibri"/>
+          <w:color w:val="000000" w:themeColor="text1"/>
+          <w:lang w:val="en-US"/>
+        </w:rPr>
+        <w:t>pertama</w:t>
+      </w:r>
+      <w:proofErr w:type="spellEnd"/>
+      <w:r>
+        <w:rPr>
+          <w:rFonts w:cs="Calibri"/>
+          <w:color w:val="000000" w:themeColor="text1"/>
+          <w:lang w:val="en-US"/>
+        </w:rPr>
+        <w:t xml:space="preserve"> kali </w:t>
+      </w:r>
+      <w:proofErr w:type="spellStart"/>
+      <w:r>
+        <w:rPr>
+          <w:rFonts w:cs="Calibri"/>
+          <w:color w:val="000000" w:themeColor="text1"/>
+          <w:lang w:val="en-US"/>
+        </w:rPr>
+        <w:t>buka</w:t>
+      </w:r>
+      <w:proofErr w:type="spellEnd"/>
+      <w:r>
+        <w:rPr>
+          <w:rFonts w:cs="Calibri"/>
+          <w:color w:val="000000" w:themeColor="text1"/>
+          <w:lang w:val="en-US"/>
+        </w:rPr>
+        <w:t xml:space="preserve"> </w:t>
+      </w:r>
+      <w:proofErr w:type="spellStart"/>
+      <w:r>
+        <w:rPr>
+          <w:rFonts w:cs="Calibri"/>
+          <w:color w:val="000000" w:themeColor="text1"/>
+          <w:lang w:val="en-US"/>
+        </w:rPr>
+        <w:t>aplikasi</w:t>
+      </w:r>
+      <w:proofErr w:type="spellEnd"/>
+    </w:p>
+    <w:p>
+      <w:pPr>
+        <w:spacing w:line="240" w:lineRule="auto"/>
+        <w:rPr>
+          <w:rFonts w:cs="Calibri"/>
+          <w:color w:val="000000" w:themeColor="text1"/>
+          <w:lang w:val="en-US"/>
+        </w:rPr>
+      </w:pPr>
+      <w:r>
+        <w:rPr>
+          <w:rFonts w:cs="Calibri"/>
+          <w:color w:val="000000" w:themeColor="text1"/>
+          <w:lang w:val="en-US"/>
+        </w:rPr>
+        <w:t xml:space="preserve">Menampilkan </w:t>
+      </w:r>
+      <w:proofErr w:type="spellStart"/>
+      <w:r>
+        <w:rPr>
+          <w:rFonts w:cs="Calibri"/>
+          <w:color w:val="000000" w:themeColor="text1"/>
+          <w:lang w:val="en-US"/>
+        </w:rPr>
+        <w:t>ke</w:t>
+      </w:r>
+      <w:proofErr w:type="spellEnd"/>
+      <w:r>
+        <w:rPr>
+          <w:rFonts w:cs="Calibri"/>
+          <w:color w:val="000000" w:themeColor="text1"/>
+          <w:lang w:val="en-US"/>
+        </w:rPr>
+        <w:t xml:space="preserve"> </w:t>
+      </w:r>
+      <w:proofErr w:type="spellStart"/>
+      <w:r>
+        <w:rPr>
+          <w:rFonts w:cs="Calibri"/>
+          <w:color w:val="000000" w:themeColor="text1"/>
+          <w:lang w:val="en-US"/>
+        </w:rPr>
+        <w:t>halaman</w:t>
+      </w:r>
+      <w:proofErr w:type="spellEnd"/>
+      <w:r>
+        <w:rPr>
+          <w:rFonts w:cs="Calibri"/>
+          <w:color w:val="000000" w:themeColor="text1"/>
+          <w:lang w:val="en-US"/>
+        </w:rPr>
+        <w:t xml:space="preserve"> login </w:t>
+      </w:r>
+      <w:proofErr w:type="spellStart"/>
+      <w:r>
+        <w:rPr>
+          <w:rFonts w:cs="Calibri"/>
+          <w:color w:val="000000" w:themeColor="text1"/>
+          <w:lang w:val="en-US"/>
+        </w:rPr>
+        <w:t>atau</w:t>
+      </w:r>
+      <w:proofErr w:type="spellEnd"/>
+      <w:r>
+        <w:rPr>
+          <w:rFonts w:cs="Calibri"/>
+          <w:color w:val="000000" w:themeColor="text1"/>
+          <w:lang w:val="en-US"/>
+        </w:rPr>
+        <w:t xml:space="preserve"> </w:t>
+      </w:r>
+      <w:proofErr w:type="spellStart"/>
+      <w:r>
+        <w:rPr>
+          <w:rFonts w:cs="Calibri"/>
+          <w:color w:val="000000" w:themeColor="text1"/>
+          <w:lang w:val="en-US"/>
+        </w:rPr>
+        <w:t>menampilkan</w:t>
+      </w:r>
+      <w:proofErr w:type="spellEnd"/>
+      <w:r>
+        <w:rPr>
+          <w:rFonts w:cs="Calibri"/>
+          <w:color w:val="000000" w:themeColor="text1"/>
+          <w:lang w:val="en-US"/>
+        </w:rPr>
+        <w:t xml:space="preserve"> </w:t>
+      </w:r>
+      <w:proofErr w:type="spellStart"/>
+      <w:r>
+        <w:rPr>
+          <w:rFonts w:cs="Calibri"/>
+          <w:color w:val="000000" w:themeColor="text1"/>
+          <w:lang w:val="en-US"/>
+        </w:rPr>
+        <w:t>halaman</w:t>
+      </w:r>
+      <w:proofErr w:type="spellEnd"/>
+      <w:r>
+        <w:rPr>
+          <w:rFonts w:cs="Calibri"/>
+          <w:color w:val="000000" w:themeColor="text1"/>
+          <w:lang w:val="en-US"/>
+        </w:rPr>
+        <w:t xml:space="preserve"> register</w:t>
+      </w:r>
     </w:p>
     <w:p>
       <w:pPr>
@@ -1852,7 +2310,7 @@
                     <pic:cNvPicPr/>
                   </pic:nvPicPr>
                   <pic:blipFill>
-                    <a:blip r:embed="rId6">
+                    <a:blip r:embed="rId7">
                       <a:extLst>
                         <a:ext uri="{28A0092B-C50C-407E-A947-70E740481C1C}">
                           <a14:useLocalDpi xmlns:a14="http://schemas.microsoft.com/office/drawing/2010/main" val="0"/>
@@ -1902,6 +2360,7 @@
           <w:color w:val="000000" w:themeColor="text1"/>
           <w:lang w:val="en-US"/>
         </w:rPr>
+        <w:lastRenderedPageBreak/>
         <w:t xml:space="preserve">Users: </w:t>
       </w:r>
       <w:r>
@@ -3809,6 +4268,7 @@
                 <w:kern w:val="0"/>
                 <w:lang w:val="en-US"/>
               </w:rPr>
+              <w:lastRenderedPageBreak/>
               <w:t>// Failed Response //</w:t>
             </w:r>
           </w:p>
@@ -3889,23 +4349,7 @@
                 <w:kern w:val="0"/>
                 <w:lang w:val="en-US"/>
               </w:rPr>
-              <w:t xml:space="preserve">    "message":</w:t>
-            </w:r>
-            <w:r>
-              <w:rPr>
-                <w:rFonts w:ascii="System Font" w:hAnsi="System Font" w:cs="System Font"/>
-                <w:kern w:val="0"/>
-                <w:lang w:val="en-US"/>
-              </w:rPr>
-              <w:t xml:space="preserve"> </w:t>
-            </w:r>
-            <w:r>
-              <w:rPr>
-                <w:rFonts w:ascii="System Font" w:hAnsi="System Font" w:cs="System Font"/>
-                <w:kern w:val="0"/>
-                <w:lang w:val="en-US"/>
-              </w:rPr>
-              <w:t>"Registration failed email/phone number already exists or invalid data",</w:t>
+              <w:t xml:space="preserve">    "message": "Registration failed email/phone number already exists or invalid data",</w:t>
             </w:r>
           </w:p>
           <w:p>
@@ -4417,32 +4861,23 @@
                 <w:color w:val="000000" w:themeColor="text1"/>
                 <w:lang w:val="en-US"/>
               </w:rPr>
-              <w:t xml:space="preserve"> </w:t>
-            </w:r>
-            <w:r>
-              <w:rPr>
-                <w:rFonts w:cs="Calibri"/>
-                <w:color w:val="000000" w:themeColor="text1"/>
-                <w:lang w:val="en-US"/>
-              </w:rPr>
-              <w:t>"</w:t>
-            </w:r>
-          </w:p>
-          <w:p>
-            <w:pPr>
-              <w:rPr>
-                <w:rFonts w:cs="Calibri"/>
-                <w:color w:val="000000" w:themeColor="text1"/>
-                <w:lang w:val="en-US"/>
-              </w:rPr>
-            </w:pPr>
-            <w:r>
-              <w:rPr>
-                <w:rFonts w:cs="Calibri"/>
-                <w:color w:val="000000" w:themeColor="text1"/>
-                <w:lang w:val="en-US"/>
-              </w:rPr>
-              <w:lastRenderedPageBreak/>
+              <w:t xml:space="preserve"> "</w:t>
+            </w:r>
+          </w:p>
+          <w:p>
+            <w:pPr>
+              <w:rPr>
+                <w:rFonts w:cs="Calibri"/>
+                <w:color w:val="000000" w:themeColor="text1"/>
+                <w:lang w:val="en-US"/>
+              </w:rPr>
+            </w:pPr>
+            <w:r>
+              <w:rPr>
+                <w:rFonts w:cs="Calibri"/>
+                <w:color w:val="000000" w:themeColor="text1"/>
+                <w:lang w:val="en-US"/>
+              </w:rPr>
               <w:t xml:space="preserve">             </w:t>
             </w:r>
             <w:r>
@@ -4475,7 +4910,6 @@
                 <w:color w:val="000000" w:themeColor="text1"/>
                 <w:lang w:val="en-US"/>
               </w:rPr>
-              <w:lastRenderedPageBreak/>
               <w:t>Response</w:t>
             </w:r>
           </w:p>
@@ -4879,6 +5313,7 @@
                 <w:kern w:val="0"/>
                 <w:lang w:val="en-US"/>
               </w:rPr>
+              <w:lastRenderedPageBreak/>
               <w:t xml:space="preserve">    }</w:t>
             </w:r>
           </w:p>
@@ -4950,41 +5385,30 @@
           <w:szCs w:val="28"/>
           <w:lang w:val="en-US"/>
         </w:rPr>
-        <w:t>Flow</w:t>
-      </w:r>
-      <w:r>
-        <w:rPr>
-          <w:rFonts w:cs="Calibri"/>
-          <w:color w:val="4C94D8" w:themeColor="text2" w:themeTint="80"/>
+        <w:t>Flowchart Pengajuan Loan</w:t>
+      </w:r>
+    </w:p>
+    <w:p>
+      <w:pPr>
+        <w:spacing w:line="240" w:lineRule="auto"/>
+        <w:jc w:val="center"/>
+        <w:rPr>
+          <w:rFonts w:cs="Calibri"/>
+          <w:color w:val="000000" w:themeColor="text1"/>
           <w:sz w:val="28"/>
           <w:szCs w:val="28"/>
           <w:lang w:val="en-US"/>
         </w:rPr>
-        <w:t>chart Pengajuan Loan</w:t>
-      </w:r>
-    </w:p>
-    <w:p>
-      <w:pPr>
-        <w:spacing w:line="240" w:lineRule="auto"/>
-        <w:jc w:val="center"/>
-        <w:rPr>
-          <w:rFonts w:cs="Calibri"/>
+      </w:pPr>
+      <w:r>
+        <w:rPr>
+          <w:rFonts w:cs="Calibri"/>
+          <w:noProof/>
           <w:color w:val="000000" w:themeColor="text1"/>
           <w:sz w:val="28"/>
           <w:szCs w:val="28"/>
           <w:lang w:val="en-US"/>
         </w:rPr>
-      </w:pPr>
-      <w:r>
-        <w:rPr>
-          <w:rFonts w:cs="Calibri"/>
-          <w:noProof/>
-          <w:color w:val="000000" w:themeColor="text1"/>
-          <w:sz w:val="28"/>
-          <w:szCs w:val="28"/>
-          <w:lang w:val="en-US"/>
-        </w:rPr>
-        <w:lastRenderedPageBreak/>
         <w:drawing>
           <wp:inline distT="0" distB="0" distL="0" distR="0" wp14:anchorId="4232B621" wp14:editId="13B2B775">
             <wp:extent cx="3112354" cy="5389685"/>
@@ -5001,7 +5425,7 @@
                     <pic:cNvPicPr/>
                   </pic:nvPicPr>
                   <pic:blipFill>
-                    <a:blip r:embed="rId7">
+                    <a:blip r:embed="rId8">
                       <a:extLst>
                         <a:ext uri="{28A0092B-C50C-407E-A947-70E740481C1C}">
                           <a14:useLocalDpi xmlns:a14="http://schemas.microsoft.com/office/drawing/2010/main" val="0"/>
@@ -5397,6 +5821,95 @@
     </w:lvl>
   </w:abstractNum>
   <w:abstractNum w:abstractNumId="3" w15:restartNumberingAfterBreak="0">
+    <w:nsid w:val="2C0740B0"/>
+    <w:multiLevelType w:val="hybridMultilevel"/>
+    <w:tmpl w:val="557265BA"/>
+    <w:lvl w:ilvl="0" w:tplc="0409000F">
+      <w:start w:val="1"/>
+      <w:numFmt w:val="decimal"/>
+      <w:lvlText w:val="%1."/>
+      <w:lvlJc w:val="left"/>
+      <w:pPr>
+        <w:ind w:left="720" w:hanging="360"/>
+      </w:pPr>
+      <w:rPr>
+        <w:rFonts w:hint="default"/>
+      </w:rPr>
+    </w:lvl>
+    <w:lvl w:ilvl="1" w:tplc="04090019" w:tentative="1">
+      <w:start w:val="1"/>
+      <w:numFmt w:val="lowerLetter"/>
+      <w:lvlText w:val="%2."/>
+      <w:lvlJc w:val="left"/>
+      <w:pPr>
+        <w:ind w:left="1440" w:hanging="360"/>
+      </w:pPr>
+    </w:lvl>
+    <w:lvl w:ilvl="2" w:tplc="0409001B" w:tentative="1">
+      <w:start w:val="1"/>
+      <w:numFmt w:val="lowerRoman"/>
+      <w:lvlText w:val="%3."/>
+      <w:lvlJc w:val="right"/>
+      <w:pPr>
+        <w:ind w:left="2160" w:hanging="180"/>
+      </w:pPr>
+    </w:lvl>
+    <w:lvl w:ilvl="3" w:tplc="0409000F" w:tentative="1">
+      <w:start w:val="1"/>
+      <w:numFmt w:val="decimal"/>
+      <w:lvlText w:val="%4."/>
+      <w:lvlJc w:val="left"/>
+      <w:pPr>
+        <w:ind w:left="2880" w:hanging="360"/>
+      </w:pPr>
+    </w:lvl>
+    <w:lvl w:ilvl="4" w:tplc="04090019" w:tentative="1">
+      <w:start w:val="1"/>
+      <w:numFmt w:val="lowerLetter"/>
+      <w:lvlText w:val="%5."/>
+      <w:lvlJc w:val="left"/>
+      <w:pPr>
+        <w:ind w:left="3600" w:hanging="360"/>
+      </w:pPr>
+    </w:lvl>
+    <w:lvl w:ilvl="5" w:tplc="0409001B" w:tentative="1">
+      <w:start w:val="1"/>
+      <w:numFmt w:val="lowerRoman"/>
+      <w:lvlText w:val="%6."/>
+      <w:lvlJc w:val="right"/>
+      <w:pPr>
+        <w:ind w:left="4320" w:hanging="180"/>
+      </w:pPr>
+    </w:lvl>
+    <w:lvl w:ilvl="6" w:tplc="0409000F" w:tentative="1">
+      <w:start w:val="1"/>
+      <w:numFmt w:val="decimal"/>
+      <w:lvlText w:val="%7."/>
+      <w:lvlJc w:val="left"/>
+      <w:pPr>
+        <w:ind w:left="5040" w:hanging="360"/>
+      </w:pPr>
+    </w:lvl>
+    <w:lvl w:ilvl="7" w:tplc="04090019" w:tentative="1">
+      <w:start w:val="1"/>
+      <w:numFmt w:val="lowerLetter"/>
+      <w:lvlText w:val="%8."/>
+      <w:lvlJc w:val="left"/>
+      <w:pPr>
+        <w:ind w:left="5760" w:hanging="360"/>
+      </w:pPr>
+    </w:lvl>
+    <w:lvl w:ilvl="8" w:tplc="0409001B" w:tentative="1">
+      <w:start w:val="1"/>
+      <w:numFmt w:val="lowerRoman"/>
+      <w:lvlText w:val="%9."/>
+      <w:lvlJc w:val="right"/>
+      <w:pPr>
+        <w:ind w:left="6480" w:hanging="180"/>
+      </w:pPr>
+    </w:lvl>
+  </w:abstractNum>
+  <w:abstractNum w:abstractNumId="4" w15:restartNumberingAfterBreak="0">
     <w:nsid w:val="423126A6"/>
     <w:multiLevelType w:val="hybridMultilevel"/>
     <w:tmpl w:val="D618E4AE"/>
@@ -5509,10 +6022,10 @@
       </w:rPr>
     </w:lvl>
   </w:abstractNum>
-  <w:abstractNum w:abstractNumId="4" w15:restartNumberingAfterBreak="0">
-    <w:nsid w:val="54866A38"/>
+  <w:abstractNum w:abstractNumId="5" w15:restartNumberingAfterBreak="0">
+    <w:nsid w:val="54405B6D"/>
     <w:multiLevelType w:val="hybridMultilevel"/>
-    <w:tmpl w:val="6344AD1C"/>
+    <w:tmpl w:val="7B3AF368"/>
     <w:lvl w:ilvl="0" w:tplc="04090001">
       <w:start w:val="1"/>
       <w:numFmt w:val="bullet"/>
@@ -5622,20 +6135,139 @@
       </w:rPr>
     </w:lvl>
   </w:abstractNum>
+  <w:abstractNum w:abstractNumId="6" w15:restartNumberingAfterBreak="0">
+    <w:nsid w:val="54866A38"/>
+    <w:multiLevelType w:val="hybridMultilevel"/>
+    <w:tmpl w:val="6344AD1C"/>
+    <w:lvl w:ilvl="0" w:tplc="04090001">
+      <w:start w:val="1"/>
+      <w:numFmt w:val="bullet"/>
+      <w:lvlText w:val=""/>
+      <w:lvlJc w:val="left"/>
+      <w:pPr>
+        <w:ind w:left="720" w:hanging="360"/>
+      </w:pPr>
+      <w:rPr>
+        <w:rFonts w:ascii="Symbol" w:hAnsi="Symbol" w:hint="default"/>
+      </w:rPr>
+    </w:lvl>
+    <w:lvl w:ilvl="1" w:tplc="04090003" w:tentative="1">
+      <w:start w:val="1"/>
+      <w:numFmt w:val="bullet"/>
+      <w:lvlText w:val="o"/>
+      <w:lvlJc w:val="left"/>
+      <w:pPr>
+        <w:ind w:left="1440" w:hanging="360"/>
+      </w:pPr>
+      <w:rPr>
+        <w:rFonts w:ascii="Courier New" w:hAnsi="Courier New" w:cs="Courier New" w:hint="default"/>
+      </w:rPr>
+    </w:lvl>
+    <w:lvl w:ilvl="2" w:tplc="04090005" w:tentative="1">
+      <w:start w:val="1"/>
+      <w:numFmt w:val="bullet"/>
+      <w:lvlText w:val=""/>
+      <w:lvlJc w:val="left"/>
+      <w:pPr>
+        <w:ind w:left="2160" w:hanging="360"/>
+      </w:pPr>
+      <w:rPr>
+        <w:rFonts w:ascii="Wingdings" w:hAnsi="Wingdings" w:hint="default"/>
+      </w:rPr>
+    </w:lvl>
+    <w:lvl w:ilvl="3" w:tplc="04090001" w:tentative="1">
+      <w:start w:val="1"/>
+      <w:numFmt w:val="bullet"/>
+      <w:lvlText w:val=""/>
+      <w:lvlJc w:val="left"/>
+      <w:pPr>
+        <w:ind w:left="2880" w:hanging="360"/>
+      </w:pPr>
+      <w:rPr>
+        <w:rFonts w:ascii="Symbol" w:hAnsi="Symbol" w:hint="default"/>
+      </w:rPr>
+    </w:lvl>
+    <w:lvl w:ilvl="4" w:tplc="04090003" w:tentative="1">
+      <w:start w:val="1"/>
+      <w:numFmt w:val="bullet"/>
+      <w:lvlText w:val="o"/>
+      <w:lvlJc w:val="left"/>
+      <w:pPr>
+        <w:ind w:left="3600" w:hanging="360"/>
+      </w:pPr>
+      <w:rPr>
+        <w:rFonts w:ascii="Courier New" w:hAnsi="Courier New" w:cs="Courier New" w:hint="default"/>
+      </w:rPr>
+    </w:lvl>
+    <w:lvl w:ilvl="5" w:tplc="04090005" w:tentative="1">
+      <w:start w:val="1"/>
+      <w:numFmt w:val="bullet"/>
+      <w:lvlText w:val=""/>
+      <w:lvlJc w:val="left"/>
+      <w:pPr>
+        <w:ind w:left="4320" w:hanging="360"/>
+      </w:pPr>
+      <w:rPr>
+        <w:rFonts w:ascii="Wingdings" w:hAnsi="Wingdings" w:hint="default"/>
+      </w:rPr>
+    </w:lvl>
+    <w:lvl w:ilvl="6" w:tplc="04090001" w:tentative="1">
+      <w:start w:val="1"/>
+      <w:numFmt w:val="bullet"/>
+      <w:lvlText w:val=""/>
+      <w:lvlJc w:val="left"/>
+      <w:pPr>
+        <w:ind w:left="5040" w:hanging="360"/>
+      </w:pPr>
+      <w:rPr>
+        <w:rFonts w:ascii="Symbol" w:hAnsi="Symbol" w:hint="default"/>
+      </w:rPr>
+    </w:lvl>
+    <w:lvl w:ilvl="7" w:tplc="04090003" w:tentative="1">
+      <w:start w:val="1"/>
+      <w:numFmt w:val="bullet"/>
+      <w:lvlText w:val="o"/>
+      <w:lvlJc w:val="left"/>
+      <w:pPr>
+        <w:ind w:left="5760" w:hanging="360"/>
+      </w:pPr>
+      <w:rPr>
+        <w:rFonts w:ascii="Courier New" w:hAnsi="Courier New" w:cs="Courier New" w:hint="default"/>
+      </w:rPr>
+    </w:lvl>
+    <w:lvl w:ilvl="8" w:tplc="04090005" w:tentative="1">
+      <w:start w:val="1"/>
+      <w:numFmt w:val="bullet"/>
+      <w:lvlText w:val=""/>
+      <w:lvlJc w:val="left"/>
+      <w:pPr>
+        <w:ind w:left="6480" w:hanging="360"/>
+      </w:pPr>
+      <w:rPr>
+        <w:rFonts w:ascii="Wingdings" w:hAnsi="Wingdings" w:hint="default"/>
+      </w:rPr>
+    </w:lvl>
+  </w:abstractNum>
   <w:num w:numId="1" w16cid:durableId="407652191">
-    <w:abstractNumId w:val="3"/>
+    <w:abstractNumId w:val="4"/>
   </w:num>
   <w:num w:numId="2" w16cid:durableId="2114859989">
     <w:abstractNumId w:val="1"/>
   </w:num>
   <w:num w:numId="3" w16cid:durableId="832842819">
-    <w:abstractNumId w:val="4"/>
+    <w:abstractNumId w:val="6"/>
   </w:num>
   <w:num w:numId="4" w16cid:durableId="519860908">
     <w:abstractNumId w:val="2"/>
   </w:num>
   <w:num w:numId="5" w16cid:durableId="1895847339">
     <w:abstractNumId w:val="0"/>
+  </w:num>
+  <w:num w:numId="6" w16cid:durableId="639768451">
+    <w:abstractNumId w:val="3"/>
+  </w:num>
+  <w:num w:numId="7" w16cid:durableId="249237109">
+    <w:abstractNumId w:val="5"/>
   </w:num>
 </w:numbering>
 </file>

</xml_diff>